<commit_message>
Final sumbission apllied the 3 components needed fqa,bact to top button, toast pop up notification, fixed fields and nav bar to task deccriptio up and down move the scripts with defer on top
</commit_message>
<xml_diff>
--- a/F1_Fan_Hub_Report.docx
+++ b/F1_Fan_Hub_Report.docx
@@ -252,7 +252,25 @@
                                     <w:sz w:val="28"/>
                                     <w:szCs w:val="28"/>
                                   </w:rPr>
-                                  <w:t xml:space="preserve">deadline: 27 </w:t>
+                                  <w:t xml:space="preserve">deadline: </w:t>
+                                </w:r>
+                                <w:r>
+                                  <w:rPr>
+                                    <w:caps/>
+                                    <w:color w:val="4BACC6" w:themeColor="accent5"/>
+                                    <w:sz w:val="28"/>
+                                    <w:szCs w:val="28"/>
+                                  </w:rPr>
+                                  <w:t>4</w:t>
+                                </w:r>
+                                <w:r>
+                                  <w:rPr>
+                                    <w:caps/>
+                                    <w:color w:val="4BACC6" w:themeColor="accent5"/>
+                                    <w:sz w:val="28"/>
+                                    <w:szCs w:val="28"/>
+                                  </w:rPr>
+                                  <w:t xml:space="preserve"> </w:t>
                                 </w:r>
                                 <w:proofErr w:type="gramStart"/>
                                 <w:r>
@@ -262,7 +280,16 @@
                                     <w:sz w:val="28"/>
                                     <w:szCs w:val="28"/>
                                   </w:rPr>
-                                  <w:t>February,</w:t>
+                                  <w:t>March</w:t>
+                                </w:r>
+                                <w:r>
+                                  <w:rPr>
+                                    <w:caps/>
+                                    <w:color w:val="4BACC6" w:themeColor="accent5"/>
+                                    <w:sz w:val="28"/>
+                                    <w:szCs w:val="28"/>
+                                  </w:rPr>
+                                  <w:t>,</w:t>
                                 </w:r>
                                 <w:proofErr w:type="gramEnd"/>
                                 <w:r>
@@ -467,7 +494,25 @@
                               <w:sz w:val="28"/>
                               <w:szCs w:val="28"/>
                             </w:rPr>
-                            <w:t xml:space="preserve">deadline: 27 </w:t>
+                            <w:t xml:space="preserve">deadline: </w:t>
+                          </w:r>
+                          <w:r>
+                            <w:rPr>
+                              <w:caps/>
+                              <w:color w:val="4BACC6" w:themeColor="accent5"/>
+                              <w:sz w:val="28"/>
+                              <w:szCs w:val="28"/>
+                            </w:rPr>
+                            <w:t>4</w:t>
+                          </w:r>
+                          <w:r>
+                            <w:rPr>
+                              <w:caps/>
+                              <w:color w:val="4BACC6" w:themeColor="accent5"/>
+                              <w:sz w:val="28"/>
+                              <w:szCs w:val="28"/>
+                            </w:rPr>
+                            <w:t xml:space="preserve"> </w:t>
                           </w:r>
                           <w:proofErr w:type="gramStart"/>
                           <w:r>
@@ -477,7 +522,16 @@
                               <w:sz w:val="28"/>
                               <w:szCs w:val="28"/>
                             </w:rPr>
-                            <w:t>February,</w:t>
+                            <w:t>March</w:t>
+                          </w:r>
+                          <w:r>
+                            <w:rPr>
+                              <w:caps/>
+                              <w:color w:val="4BACC6" w:themeColor="accent5"/>
+                              <w:sz w:val="28"/>
+                              <w:szCs w:val="28"/>
+                            </w:rPr>
+                            <w:t>,</w:t>
                           </w:r>
                           <w:proofErr w:type="gramEnd"/>
                           <w:r>
@@ -1281,7 +1335,7 @@
           <w:szCs w:val="24"/>
         </w:rPr>
       </w:pPr>
-      <w:bookmarkStart w:id="0" w:name="_Toc222853365"/>
+      <w:bookmarkStart w:id="0" w:name="_Toc223433402"/>
       <w:r>
         <w:rPr>
           <w:rFonts w:ascii="Times New Roman" w:hAnsi="Times New Roman" w:cs="Times New Roman"/>
@@ -1296,7 +1350,10 @@
     <w:sdt>
       <w:sdtPr>
         <w:rPr>
-          <w:rFonts w:ascii="Times New Roman" w:hAnsi="Times New Roman" w:cs="Times New Roman"/>
+          <w:rFonts w:ascii="Times New Roman" w:eastAsiaTheme="minorEastAsia" w:hAnsi="Times New Roman" w:cs="Times New Roman"/>
+          <w:b w:val="0"/>
+          <w:bCs w:val="0"/>
+          <w:color w:val="auto"/>
           <w:sz w:val="24"/>
           <w:szCs w:val="24"/>
           <w:lang w:val="el-GR"/>
@@ -1307,12 +1364,6 @@
           <w:docPartUnique/>
         </w:docPartObj>
       </w:sdtPr>
-      <w:sdtEndPr>
-        <w:rPr>
-          <w:rFonts w:eastAsiaTheme="minorEastAsia"/>
-          <w:color w:val="auto"/>
-        </w:rPr>
-      </w:sdtEndPr>
       <w:sdtContent>
         <w:p>
           <w:pPr>
@@ -1371,7 +1422,7 @@
             </w:rPr>
             <w:fldChar w:fldCharType="separate"/>
           </w:r>
-          <w:hyperlink w:anchor="_Toc222853365" w:history="1">
+          <w:hyperlink w:anchor="_Toc223433402" w:history="1">
             <w:r>
               <w:rPr>
                 <w:rStyle w:val="-"/>
@@ -1399,7 +1450,7 @@
                 <w:noProof/>
                 <w:webHidden/>
               </w:rPr>
-              <w:instrText xml:space="preserve"> PAGEREF _Toc222853365 \h </w:instrText>
+              <w:instrText xml:space="preserve"> PAGEREF _Toc223433402 \h </w:instrText>
             </w:r>
             <w:r>
               <w:rPr>
@@ -1444,7 +1495,7 @@
               <w14:ligatures w14:val="standardContextual"/>
             </w:rPr>
           </w:pPr>
-          <w:hyperlink w:anchor="_Toc222853366" w:history="1">
+          <w:hyperlink w:anchor="_Toc223433403" w:history="1">
             <w:r>
               <w:rPr>
                 <w:rStyle w:val="-"/>
@@ -1472,7 +1523,7 @@
                 <w:noProof/>
                 <w:webHidden/>
               </w:rPr>
-              <w:instrText xml:space="preserve"> PAGEREF _Toc222853366 \h </w:instrText>
+              <w:instrText xml:space="preserve"> PAGEREF _Toc223433403 \h </w:instrText>
             </w:r>
             <w:r>
               <w:rPr>
@@ -1492,7 +1543,7 @@
                 <w:noProof/>
                 <w:webHidden/>
               </w:rPr>
-              <w:t>1</w:t>
+              <w:t>2</w:t>
             </w:r>
             <w:r>
               <w:rPr>
@@ -1517,7 +1568,7 @@
               <w14:ligatures w14:val="standardContextual"/>
             </w:rPr>
           </w:pPr>
-          <w:hyperlink w:anchor="_Toc222853367" w:history="1">
+          <w:hyperlink w:anchor="_Toc223433404" w:history="1">
             <w:r>
               <w:rPr>
                 <w:rStyle w:val="-"/>
@@ -1545,7 +1596,7 @@
                 <w:noProof/>
                 <w:webHidden/>
               </w:rPr>
-              <w:instrText xml:space="preserve"> PAGEREF _Toc222853367 \h </w:instrText>
+              <w:instrText xml:space="preserve"> PAGEREF _Toc223433404 \h </w:instrText>
             </w:r>
             <w:r>
               <w:rPr>
@@ -1590,7 +1641,7 @@
               <w14:ligatures w14:val="standardContextual"/>
             </w:rPr>
           </w:pPr>
-          <w:hyperlink w:anchor="_Toc222853368" w:history="1">
+          <w:hyperlink w:anchor="_Toc223433405" w:history="1">
             <w:r>
               <w:rPr>
                 <w:rStyle w:val="-"/>
@@ -1618,7 +1669,7 @@
                 <w:noProof/>
                 <w:webHidden/>
               </w:rPr>
-              <w:instrText xml:space="preserve"> PAGEREF _Toc222853368 \h </w:instrText>
+              <w:instrText xml:space="preserve"> PAGEREF _Toc223433405 \h </w:instrText>
             </w:r>
             <w:r>
               <w:rPr>
@@ -1663,7 +1714,7 @@
               <w14:ligatures w14:val="standardContextual"/>
             </w:rPr>
           </w:pPr>
-          <w:hyperlink w:anchor="_Toc222853369" w:history="1">
+          <w:hyperlink w:anchor="_Toc223433406" w:history="1">
             <w:r>
               <w:rPr>
                 <w:rStyle w:val="-"/>
@@ -1691,7 +1742,7 @@
                 <w:noProof/>
                 <w:webHidden/>
               </w:rPr>
-              <w:instrText xml:space="preserve"> PAGEREF _Toc222853369 \h </w:instrText>
+              <w:instrText xml:space="preserve"> PAGEREF _Toc223433406 \h </w:instrText>
             </w:r>
             <w:r>
               <w:rPr>
@@ -1711,7 +1762,7 @@
                 <w:noProof/>
                 <w:webHidden/>
               </w:rPr>
-              <w:t>2</w:t>
+              <w:t>3</w:t>
             </w:r>
             <w:r>
               <w:rPr>
@@ -1736,7 +1787,7 @@
               <w14:ligatures w14:val="standardContextual"/>
             </w:rPr>
           </w:pPr>
-          <w:hyperlink w:anchor="_Toc222853370" w:history="1">
+          <w:hyperlink w:anchor="_Toc223433407" w:history="1">
             <w:r>
               <w:rPr>
                 <w:rStyle w:val="-"/>
@@ -1764,7 +1815,7 @@
                 <w:noProof/>
                 <w:webHidden/>
               </w:rPr>
-              <w:instrText xml:space="preserve"> PAGEREF _Toc222853370 \h </w:instrText>
+              <w:instrText xml:space="preserve"> PAGEREF _Toc223433407 \h </w:instrText>
             </w:r>
             <w:r>
               <w:rPr>
@@ -1784,7 +1835,7 @@
                 <w:noProof/>
                 <w:webHidden/>
               </w:rPr>
-              <w:t>2</w:t>
+              <w:t>3</w:t>
             </w:r>
             <w:r>
               <w:rPr>
@@ -1809,7 +1860,7 @@
               <w14:ligatures w14:val="standardContextual"/>
             </w:rPr>
           </w:pPr>
-          <w:hyperlink w:anchor="_Toc222853371" w:history="1">
+          <w:hyperlink w:anchor="_Toc223433408" w:history="1">
             <w:r>
               <w:rPr>
                 <w:rStyle w:val="-"/>
@@ -1837,7 +1888,7 @@
                 <w:noProof/>
                 <w:webHidden/>
               </w:rPr>
-              <w:instrText xml:space="preserve"> PAGEREF _Toc222853371 \h </w:instrText>
+              <w:instrText xml:space="preserve"> PAGEREF _Toc223433408 \h </w:instrText>
             </w:r>
             <w:r>
               <w:rPr>
@@ -1857,7 +1908,7 @@
                 <w:noProof/>
                 <w:webHidden/>
               </w:rPr>
-              <w:t>2</w:t>
+              <w:t>3</w:t>
             </w:r>
             <w:r>
               <w:rPr>
@@ -1882,7 +1933,7 @@
               <w14:ligatures w14:val="standardContextual"/>
             </w:rPr>
           </w:pPr>
-          <w:hyperlink w:anchor="_Toc222853372" w:history="1">
+          <w:hyperlink w:anchor="_Toc223433409" w:history="1">
             <w:r>
               <w:rPr>
                 <w:rStyle w:val="-"/>
@@ -1910,80 +1961,7 @@
                 <w:noProof/>
                 <w:webHidden/>
               </w:rPr>
-              <w:instrText xml:space="preserve"> PAGEREF _Toc222853372 \h </w:instrText>
-            </w:r>
-            <w:r>
-              <w:rPr>
-                <w:noProof/>
-                <w:webHidden/>
-              </w:rPr>
-            </w:r>
-            <w:r>
-              <w:rPr>
-                <w:noProof/>
-                <w:webHidden/>
-              </w:rPr>
-              <w:fldChar w:fldCharType="separate"/>
-            </w:r>
-            <w:r>
-              <w:rPr>
-                <w:noProof/>
-                <w:webHidden/>
-              </w:rPr>
-              <w:t>2</w:t>
-            </w:r>
-            <w:r>
-              <w:rPr>
-                <w:noProof/>
-                <w:webHidden/>
-              </w:rPr>
-              <w:fldChar w:fldCharType="end"/>
-            </w:r>
-          </w:hyperlink>
-        </w:p>
-        <w:p>
-          <w:pPr>
-            <w:pStyle w:val="28"/>
-            <w:tabs>
-              <w:tab w:val="right" w:leader="dot" w:pos="8630"/>
-            </w:tabs>
-            <w:rPr>
-              <w:noProof/>
-              <w:kern w:val="2"/>
-              <w:sz w:val="24"/>
-              <w:szCs w:val="24"/>
-              <w14:ligatures w14:val="standardContextual"/>
-            </w:rPr>
-          </w:pPr>
-          <w:hyperlink w:anchor="_Toc222853373" w:history="1">
-            <w:r>
-              <w:rPr>
-                <w:rStyle w:val="-"/>
-                <w:rFonts w:ascii="Times New Roman" w:hAnsi="Times New Roman" w:cs="Times New Roman"/>
-                <w:noProof/>
-              </w:rPr>
-              <w:t>3. GitHub Repository</w:t>
-            </w:r>
-            <w:r>
-              <w:rPr>
-                <w:noProof/>
-                <w:webHidden/>
-              </w:rPr>
-              <w:tab/>
-            </w:r>
-            <w:r>
-              <w:rPr>
-                <w:noProof/>
-                <w:webHidden/>
-              </w:rPr>
-              <w:fldChar w:fldCharType="begin"/>
-            </w:r>
-            <w:r>
-              <w:rPr>
-                <w:noProof/>
-                <w:webHidden/>
-              </w:rPr>
-              <w:instrText xml:space="preserve"> PAGEREF _Toc222853373 \h </w:instrText>
+              <w:instrText xml:space="preserve"> PAGEREF _Toc223433409 \h </w:instrText>
             </w:r>
             <w:r>
               <w:rPr>
@@ -2028,14 +2006,14 @@
               <w14:ligatures w14:val="standardContextual"/>
             </w:rPr>
           </w:pPr>
-          <w:hyperlink w:anchor="_Toc222853374" w:history="1">
+          <w:hyperlink w:anchor="_Toc223433410" w:history="1">
             <w:r>
               <w:rPr>
                 <w:rStyle w:val="-"/>
                 <w:rFonts w:ascii="Times New Roman" w:hAnsi="Times New Roman" w:cs="Times New Roman"/>
                 <w:noProof/>
               </w:rPr>
-              <w:t>4. Lighthouse Audit Results</w:t>
+              <w:t>3. GitHub Repository</w:t>
             </w:r>
             <w:r>
               <w:rPr>
@@ -2056,7 +2034,7 @@
                 <w:noProof/>
                 <w:webHidden/>
               </w:rPr>
-              <w:instrText xml:space="preserve"> PAGEREF _Toc222853374 \h </w:instrText>
+              <w:instrText xml:space="preserve"> PAGEREF _Toc223433410 \h </w:instrText>
             </w:r>
             <w:r>
               <w:rPr>
@@ -2101,14 +2079,14 @@
               <w14:ligatures w14:val="standardContextual"/>
             </w:rPr>
           </w:pPr>
-          <w:hyperlink w:anchor="_Toc222853375" w:history="1">
+          <w:hyperlink w:anchor="_Toc223433411" w:history="1">
             <w:r>
               <w:rPr>
                 <w:rStyle w:val="-"/>
                 <w:rFonts w:ascii="Times New Roman" w:hAnsi="Times New Roman" w:cs="Times New Roman"/>
                 <w:noProof/>
               </w:rPr>
-              <w:t>5. Reflections</w:t>
+              <w:t>4. Lighthouse Audit Results</w:t>
             </w:r>
             <w:r>
               <w:rPr>
@@ -2129,7 +2107,72 @@
                 <w:noProof/>
                 <w:webHidden/>
               </w:rPr>
-              <w:instrText xml:space="preserve"> PAGEREF _Toc222853375 \h </w:instrText>
+              <w:instrText xml:space="preserve"> PAGEREF _Toc223433411 \h </w:instrText>
+            </w:r>
+            <w:r>
+              <w:rPr>
+                <w:noProof/>
+                <w:webHidden/>
+              </w:rPr>
+            </w:r>
+            <w:r>
+              <w:rPr>
+                <w:noProof/>
+                <w:webHidden/>
+              </w:rPr>
+              <w:fldChar w:fldCharType="separate"/>
+            </w:r>
+            <w:r>
+              <w:rPr>
+                <w:noProof/>
+                <w:webHidden/>
+              </w:rPr>
+              <w:t>3</w:t>
+            </w:r>
+            <w:r>
+              <w:rPr>
+                <w:noProof/>
+                <w:webHidden/>
+              </w:rPr>
+              <w:fldChar w:fldCharType="end"/>
+            </w:r>
+          </w:hyperlink>
+        </w:p>
+        <w:p>
+          <w:pPr>
+            <w:pStyle w:val="28"/>
+            <w:tabs>
+              <w:tab w:val="right" w:leader="dot" w:pos="8630"/>
+            </w:tabs>
+            <w:rPr>
+              <w:noProof/>
+              <w:kern w:val="2"/>
+              <w:sz w:val="24"/>
+              <w:szCs w:val="24"/>
+              <w14:ligatures w14:val="standardContextual"/>
+            </w:rPr>
+          </w:pPr>
+          <w:hyperlink w:anchor="_Toc223433412" w:history="1">
+            <w:r>
+              <w:rPr>
+                <w:noProof/>
+                <w:webHidden/>
+              </w:rPr>
+              <w:tab/>
+            </w:r>
+            <w:r>
+              <w:rPr>
+                <w:noProof/>
+                <w:webHidden/>
+              </w:rPr>
+              <w:fldChar w:fldCharType="begin"/>
+            </w:r>
+            <w:r>
+              <w:rPr>
+                <w:noProof/>
+                <w:webHidden/>
+              </w:rPr>
+              <w:instrText xml:space="preserve"> PAGEREF _Toc223433412 \h </w:instrText>
             </w:r>
             <w:r>
               <w:rPr>
@@ -2150,6 +2193,225 @@
                 <w:webHidden/>
               </w:rPr>
               <w:t>5</w:t>
+            </w:r>
+            <w:r>
+              <w:rPr>
+                <w:noProof/>
+                <w:webHidden/>
+              </w:rPr>
+              <w:fldChar w:fldCharType="end"/>
+            </w:r>
+          </w:hyperlink>
+        </w:p>
+        <w:p>
+          <w:pPr>
+            <w:pStyle w:val="28"/>
+            <w:tabs>
+              <w:tab w:val="right" w:leader="dot" w:pos="8630"/>
+            </w:tabs>
+            <w:rPr>
+              <w:noProof/>
+              <w:kern w:val="2"/>
+              <w:sz w:val="24"/>
+              <w:szCs w:val="24"/>
+              <w14:ligatures w14:val="standardContextual"/>
+            </w:rPr>
+          </w:pPr>
+          <w:hyperlink w:anchor="_Toc223433413" w:history="1">
+            <w:r>
+              <w:rPr>
+                <w:rStyle w:val="-"/>
+                <w:rFonts w:ascii="Times New Roman" w:hAnsi="Times New Roman" w:cs="Times New Roman"/>
+                <w:noProof/>
+              </w:rPr>
+              <w:t>5. Additional Components Implemented</w:t>
+            </w:r>
+            <w:r>
+              <w:rPr>
+                <w:noProof/>
+                <w:webHidden/>
+              </w:rPr>
+              <w:tab/>
+            </w:r>
+            <w:r>
+              <w:rPr>
+                <w:noProof/>
+                <w:webHidden/>
+              </w:rPr>
+              <w:fldChar w:fldCharType="begin"/>
+            </w:r>
+            <w:r>
+              <w:rPr>
+                <w:noProof/>
+                <w:webHidden/>
+              </w:rPr>
+              <w:instrText xml:space="preserve"> PAGEREF _Toc223433413 \h </w:instrText>
+            </w:r>
+            <w:r>
+              <w:rPr>
+                <w:noProof/>
+                <w:webHidden/>
+              </w:rPr>
+            </w:r>
+            <w:r>
+              <w:rPr>
+                <w:noProof/>
+                <w:webHidden/>
+              </w:rPr>
+              <w:fldChar w:fldCharType="separate"/>
+            </w:r>
+            <w:r>
+              <w:rPr>
+                <w:noProof/>
+                <w:webHidden/>
+              </w:rPr>
+              <w:t>5</w:t>
+            </w:r>
+            <w:r>
+              <w:rPr>
+                <w:noProof/>
+                <w:webHidden/>
+              </w:rPr>
+              <w:fldChar w:fldCharType="end"/>
+            </w:r>
+          </w:hyperlink>
+        </w:p>
+        <w:p>
+          <w:pPr>
+            <w:pStyle w:val="28"/>
+            <w:tabs>
+              <w:tab w:val="right" w:leader="dot" w:pos="8630"/>
+            </w:tabs>
+            <w:rPr>
+              <w:noProof/>
+              <w:kern w:val="2"/>
+              <w:sz w:val="24"/>
+              <w:szCs w:val="24"/>
+              <w14:ligatures w14:val="standardContextual"/>
+            </w:rPr>
+          </w:pPr>
+          <w:hyperlink w:anchor="_Toc223433414" w:history="1">
+            <w:r>
+              <w:rPr>
+                <w:rStyle w:val="-"/>
+                <w:rFonts w:ascii="Times New Roman" w:hAnsi="Times New Roman" w:cs="Times New Roman"/>
+                <w:noProof/>
+              </w:rPr>
+              <w:t>6. AI Usage</w:t>
+            </w:r>
+            <w:r>
+              <w:rPr>
+                <w:noProof/>
+                <w:webHidden/>
+              </w:rPr>
+              <w:tab/>
+            </w:r>
+            <w:r>
+              <w:rPr>
+                <w:noProof/>
+                <w:webHidden/>
+              </w:rPr>
+              <w:fldChar w:fldCharType="begin"/>
+            </w:r>
+            <w:r>
+              <w:rPr>
+                <w:noProof/>
+                <w:webHidden/>
+              </w:rPr>
+              <w:instrText xml:space="preserve"> PAGEREF _Toc223433414 \h </w:instrText>
+            </w:r>
+            <w:r>
+              <w:rPr>
+                <w:noProof/>
+                <w:webHidden/>
+              </w:rPr>
+            </w:r>
+            <w:r>
+              <w:rPr>
+                <w:noProof/>
+                <w:webHidden/>
+              </w:rPr>
+              <w:fldChar w:fldCharType="separate"/>
+            </w:r>
+            <w:r>
+              <w:rPr>
+                <w:noProof/>
+                <w:webHidden/>
+              </w:rPr>
+              <w:t>6</w:t>
+            </w:r>
+            <w:r>
+              <w:rPr>
+                <w:noProof/>
+                <w:webHidden/>
+              </w:rPr>
+              <w:fldChar w:fldCharType="end"/>
+            </w:r>
+          </w:hyperlink>
+        </w:p>
+        <w:p>
+          <w:pPr>
+            <w:pStyle w:val="28"/>
+            <w:tabs>
+              <w:tab w:val="right" w:leader="dot" w:pos="8630"/>
+            </w:tabs>
+            <w:rPr>
+              <w:noProof/>
+              <w:kern w:val="2"/>
+              <w:sz w:val="24"/>
+              <w:szCs w:val="24"/>
+              <w14:ligatures w14:val="standardContextual"/>
+            </w:rPr>
+          </w:pPr>
+          <w:hyperlink w:anchor="_Toc223433415" w:history="1">
+            <w:r>
+              <w:rPr>
+                <w:rStyle w:val="-"/>
+                <w:rFonts w:ascii="Times New Roman" w:hAnsi="Times New Roman" w:cs="Times New Roman"/>
+                <w:noProof/>
+              </w:rPr>
+              <w:t>7. Reflections</w:t>
+            </w:r>
+            <w:r>
+              <w:rPr>
+                <w:noProof/>
+                <w:webHidden/>
+              </w:rPr>
+              <w:tab/>
+            </w:r>
+            <w:r>
+              <w:rPr>
+                <w:noProof/>
+                <w:webHidden/>
+              </w:rPr>
+              <w:fldChar w:fldCharType="begin"/>
+            </w:r>
+            <w:r>
+              <w:rPr>
+                <w:noProof/>
+                <w:webHidden/>
+              </w:rPr>
+              <w:instrText xml:space="preserve"> PAGEREF _Toc223433415 \h </w:instrText>
+            </w:r>
+            <w:r>
+              <w:rPr>
+                <w:noProof/>
+                <w:webHidden/>
+              </w:rPr>
+            </w:r>
+            <w:r>
+              <w:rPr>
+                <w:noProof/>
+                <w:webHidden/>
+              </w:rPr>
+              <w:fldChar w:fldCharType="separate"/>
+            </w:r>
+            <w:r>
+              <w:rPr>
+                <w:noProof/>
+                <w:webHidden/>
+              </w:rPr>
+              <w:t>7</w:t>
             </w:r>
             <w:r>
               <w:rPr>
@@ -2191,7 +2453,7 @@
           <w:szCs w:val="28"/>
         </w:rPr>
       </w:pPr>
-      <w:bookmarkStart w:id="1" w:name="_Toc222853366"/>
+      <w:bookmarkStart w:id="1" w:name="_Toc223433403"/>
       <w:r>
         <w:rPr>
           <w:rFonts w:ascii="Times New Roman" w:hAnsi="Times New Roman" w:cs="Times New Roman"/>
@@ -2357,6 +2619,14 @@
           <w:szCs w:val="24"/>
         </w:rPr>
         <w:br/>
+      </w:r>
+      <w:r>
+        <w:rPr>
+          <w:rFonts w:ascii="Times New Roman" w:hAnsi="Times New Roman" w:cs="Times New Roman"/>
+          <w:sz w:val="24"/>
+          <w:szCs w:val="24"/>
+        </w:rPr>
+        <w:lastRenderedPageBreak/>
         <w:t>- Read (Display tasks dynamically)</w:t>
       </w:r>
       <w:r>
@@ -2396,14 +2666,13 @@
           <w:szCs w:val="28"/>
         </w:rPr>
       </w:pPr>
-      <w:bookmarkStart w:id="2" w:name="_Toc222853367"/>
+      <w:bookmarkStart w:id="2" w:name="_Toc223433404"/>
       <w:r>
         <w:rPr>
           <w:rFonts w:ascii="Times New Roman" w:hAnsi="Times New Roman" w:cs="Times New Roman"/>
           <w:sz w:val="28"/>
           <w:szCs w:val="28"/>
         </w:rPr>
-        <w:lastRenderedPageBreak/>
         <w:t>2. Detailed Documentation of Coding Decisions</w:t>
       </w:r>
       <w:bookmarkEnd w:id="2"/>
@@ -2417,7 +2686,7 @@
           <w:szCs w:val="28"/>
         </w:rPr>
       </w:pPr>
-      <w:bookmarkStart w:id="3" w:name="_Toc222853368"/>
+      <w:bookmarkStart w:id="3" w:name="_Toc223433405"/>
       <w:r>
         <w:rPr>
           <w:rFonts w:ascii="Times New Roman" w:hAnsi="Times New Roman" w:cs="Times New Roman"/>
@@ -2633,7 +2902,7 @@
           <w:szCs w:val="28"/>
         </w:rPr>
       </w:pPr>
-      <w:bookmarkStart w:id="4" w:name="_Toc222853369"/>
+      <w:bookmarkStart w:id="4" w:name="_Toc223433406"/>
       <w:r>
         <w:rPr>
           <w:rFonts w:ascii="Times New Roman" w:hAnsi="Times New Roman" w:cs="Times New Roman"/>
@@ -2687,7 +2956,7 @@
           <w:szCs w:val="28"/>
         </w:rPr>
       </w:pPr>
-      <w:bookmarkStart w:id="5" w:name="_Toc222853370"/>
+      <w:bookmarkStart w:id="5" w:name="_Toc223433407"/>
       <w:r>
         <w:rPr>
           <w:rFonts w:ascii="Times New Roman" w:hAnsi="Times New Roman" w:cs="Times New Roman"/>
@@ -2742,7 +3011,7 @@
           <w:szCs w:val="28"/>
         </w:rPr>
       </w:pPr>
-      <w:bookmarkStart w:id="6" w:name="_Toc222853371"/>
+      <w:bookmarkStart w:id="6" w:name="_Toc223433408"/>
       <w:r>
         <w:rPr>
           <w:rFonts w:ascii="Times New Roman" w:hAnsi="Times New Roman" w:cs="Times New Roman"/>
@@ -2815,13 +3084,14 @@
           <w:szCs w:val="28"/>
         </w:rPr>
       </w:pPr>
-      <w:bookmarkStart w:id="7" w:name="_Toc222853372"/>
+      <w:bookmarkStart w:id="7" w:name="_Toc223433409"/>
       <w:r>
         <w:rPr>
           <w:rFonts w:ascii="Times New Roman" w:hAnsi="Times New Roman" w:cs="Times New Roman"/>
           <w:sz w:val="28"/>
           <w:szCs w:val="28"/>
         </w:rPr>
+        <w:lastRenderedPageBreak/>
         <w:t>2.5 Accessibility Considerations</w:t>
       </w:r>
       <w:bookmarkEnd w:id="7"/>
@@ -2876,14 +3146,6 @@
           <w:szCs w:val="24"/>
         </w:rPr>
         <w:br/>
-      </w:r>
-      <w:r>
-        <w:rPr>
-          <w:rFonts w:ascii="Times New Roman" w:hAnsi="Times New Roman" w:cs="Times New Roman"/>
-          <w:sz w:val="24"/>
-          <w:szCs w:val="24"/>
-        </w:rPr>
-        <w:lastRenderedPageBreak/>
         <w:t>- Improved color contrast for dark mode</w:t>
       </w:r>
       <w:r>
@@ -2905,7 +3167,7 @@
           <w:szCs w:val="24"/>
         </w:rPr>
       </w:pPr>
-      <w:bookmarkStart w:id="8" w:name="_Toc222853373"/>
+      <w:bookmarkStart w:id="8" w:name="_Toc223433410"/>
       <w:r>
         <w:rPr>
           <w:rFonts w:ascii="Times New Roman" w:hAnsi="Times New Roman" w:cs="Times New Roman"/>
@@ -2956,25 +3218,7 @@
             <w:sz w:val="24"/>
             <w:szCs w:val="24"/>
           </w:rPr>
-          <w:t>https://github</w:t>
-        </w:r>
-        <w:r>
-          <w:rPr>
-            <w:rStyle w:val="-"/>
-            <w:rFonts w:ascii="Times New Roman" w:hAnsi="Times New Roman" w:cs="Times New Roman"/>
-            <w:sz w:val="24"/>
-            <w:szCs w:val="24"/>
-          </w:rPr>
-          <w:t>.</w:t>
-        </w:r>
-        <w:r>
-          <w:rPr>
-            <w:rStyle w:val="-"/>
-            <w:rFonts w:ascii="Times New Roman" w:hAnsi="Times New Roman" w:cs="Times New Roman"/>
-            <w:sz w:val="24"/>
-            <w:szCs w:val="24"/>
-          </w:rPr>
-          <w:t>com/Zervakos1/f1-formula-fans-site</w:t>
+          <w:t>https://github.com/Zervakos1/f1-formula-fans-site</w:t>
         </w:r>
       </w:hyperlink>
     </w:p>
@@ -2987,7 +3231,7 @@
           <w:szCs w:val="24"/>
         </w:rPr>
       </w:pPr>
-      <w:bookmarkStart w:id="9" w:name="_Toc222853374"/>
+      <w:bookmarkStart w:id="9" w:name="_Toc223433411"/>
       <w:r>
         <w:rPr>
           <w:rFonts w:ascii="Times New Roman" w:hAnsi="Times New Roman" w:cs="Times New Roman"/>
@@ -3086,7 +3330,7 @@
         </w:rPr>
         <w:lastRenderedPageBreak/>
         <w:drawing>
-          <wp:inline distT="0" distB="0" distL="0" distR="0" wp14:anchorId="0C960933" wp14:editId="649379FB">
+          <wp:inline distT="0" distB="0" distL="0" distR="0" wp14:anchorId="198F3883" wp14:editId="2677B995">
             <wp:extent cx="5019675" cy="6553465"/>
             <wp:effectExtent l="0" t="0" r="0" b="0"/>
             <wp:docPr id="1748742895" name="Εικόνα 1" descr="Εικόνα που περιέχει κείμενο, στιγμιότυπο οθόνης, λογισμικό, ιστοσελίδα&#10;&#10;Το περιεχόμενο που δημιουργείται από AI ενδέχεται να είναι εσφαλμένο."/>
@@ -3137,21 +3381,14 @@
     </w:p>
     <w:p>
       <w:pPr>
-        <w:rPr>
-          <w:rFonts w:ascii="Times New Roman" w:hAnsi="Times New Roman" w:cs="Times New Roman"/>
-          <w:sz w:val="24"/>
-          <w:szCs w:val="24"/>
+        <w:pStyle w:val="21"/>
+        <w:rPr>
+          <w:rFonts w:ascii="Times New Roman" w:hAnsi="Times New Roman" w:cs="Times New Roman"/>
+          <w:sz w:val="28"/>
+          <w:szCs w:val="28"/>
         </w:rPr>
       </w:pPr>
-      <w:r>
-        <w:rPr>
-          <w:rFonts w:ascii="Times New Roman" w:hAnsi="Times New Roman" w:cs="Times New Roman"/>
-          <w:sz w:val="24"/>
-          <w:szCs w:val="24"/>
-        </w:rPr>
-        <w:lastRenderedPageBreak/>
-        <w:br/>
-      </w:r>
+      <w:bookmarkStart w:id="10" w:name="_Toc223433412"/>
       <w:r>
         <w:rPr>
           <w:rFonts w:ascii="Times New Roman" w:hAnsi="Times New Roman" w:cs="Times New Roman"/>
@@ -3159,11 +3396,12 @@
           <w:sz w:val="24"/>
           <w:szCs w:val="24"/>
         </w:rPr>
+        <w:lastRenderedPageBreak/>
         <w:drawing>
-          <wp:inline distT="0" distB="0" distL="0" distR="0" wp14:anchorId="35DE3674" wp14:editId="7B56991B">
+          <wp:inline distT="0" distB="0" distL="0" distR="0" wp14:anchorId="0E20ABE6" wp14:editId="6AF6F58B">
             <wp:extent cx="5476875" cy="4314825"/>
             <wp:effectExtent l="0" t="0" r="9525" b="9525"/>
-            <wp:docPr id="1090740244" name="Εικόνα 2"/>
+            <wp:docPr id="1090740244" name="Εικόνα 2" descr="Εικόνα που περιέχει κείμενο, στιγμιότυπο οθόνης, ιστοσελίδα, γραμματοσειρά&#10;&#10;Το περιεχόμενο που δημιουργείται από AI ενδέχεται να είναι εσφαλμένο."/>
             <wp:cNvGraphicFramePr>
               <a:graphicFrameLocks xmlns:a="http://schemas.openxmlformats.org/drawingml/2006/main" noChangeAspect="1"/>
             </wp:cNvGraphicFramePr>
@@ -3171,7 +3409,7 @@
               <a:graphicData uri="http://schemas.openxmlformats.org/drawingml/2006/picture">
                 <pic:pic xmlns:pic="http://schemas.openxmlformats.org/drawingml/2006/picture">
                   <pic:nvPicPr>
-                    <pic:cNvPr id="0" name="Picture 2"/>
+                    <pic:cNvPr id="1090740244" name="Εικόνα 2" descr="Εικόνα που περιέχει κείμενο, στιγμιότυπο οθόνης, ιστοσελίδα, γραμματοσειρά&#10;&#10;Το περιεχόμενο που δημιουργείται από AI ενδέχεται να είναι εσφαλμένο."/>
                     <pic:cNvPicPr>
                       <a:picLocks noChangeAspect="1" noChangeArrowheads="1"/>
                     </pic:cNvPicPr>
@@ -3208,6 +3446,7 @@
           </wp:inline>
         </w:drawing>
       </w:r>
+      <w:bookmarkEnd w:id="10"/>
     </w:p>
     <w:p>
       <w:pPr>
@@ -3218,16 +3457,718 @@
           <w:szCs w:val="28"/>
         </w:rPr>
       </w:pPr>
-      <w:bookmarkStart w:id="10" w:name="_Toc222853375"/>
+      <w:bookmarkStart w:id="11" w:name="_Toc223433413"/>
       <w:r>
         <w:rPr>
           <w:rFonts w:ascii="Times New Roman" w:hAnsi="Times New Roman" w:cs="Times New Roman"/>
           <w:sz w:val="28"/>
           <w:szCs w:val="28"/>
         </w:rPr>
-        <w:t>5. Reflections</w:t>
+        <w:t>5. Additional Components Implemented</w:t>
       </w:r>
-      <w:bookmarkEnd w:id="10"/>
+      <w:bookmarkEnd w:id="11"/>
+    </w:p>
+    <w:p>
+      <w:pPr>
+        <w:rPr>
+          <w:rFonts w:ascii="Times New Roman" w:hAnsi="Times New Roman" w:cs="Times New Roman"/>
+          <w:b/>
+          <w:bCs/>
+          <w:sz w:val="24"/>
+          <w:szCs w:val="24"/>
+        </w:rPr>
+      </w:pPr>
+      <w:r>
+        <w:rPr>
+          <w:rFonts w:ascii="Times New Roman" w:hAnsi="Times New Roman" w:cs="Times New Roman"/>
+          <w:b/>
+          <w:bCs/>
+        </w:rPr>
+        <w:t>1</w:t>
+      </w:r>
+      <w:r>
+        <w:rPr>
+          <w:rFonts w:ascii="Times New Roman" w:hAnsi="Times New Roman" w:cs="Times New Roman"/>
+          <w:b/>
+          <w:bCs/>
+          <w:sz w:val="24"/>
+          <w:szCs w:val="24"/>
+        </w:rPr>
+        <w:t>) FAQ Accordion (About Page)</w:t>
+      </w:r>
+    </w:p>
+    <w:p>
+      <w:pPr>
+        <w:rPr>
+          <w:rFonts w:ascii="Times New Roman" w:hAnsi="Times New Roman" w:cs="Times New Roman"/>
+          <w:sz w:val="24"/>
+          <w:szCs w:val="24"/>
+        </w:rPr>
+      </w:pPr>
+      <w:r>
+        <w:rPr>
+          <w:rFonts w:ascii="Times New Roman" w:hAnsi="Times New Roman" w:cs="Times New Roman"/>
+          <w:b/>
+          <w:bCs/>
+          <w:sz w:val="24"/>
+          <w:szCs w:val="24"/>
+        </w:rPr>
+        <w:t>Location:</w:t>
+      </w:r>
+      <w:r>
+        <w:rPr>
+          <w:rFonts w:ascii="Times New Roman" w:hAnsi="Times New Roman" w:cs="Times New Roman"/>
+          <w:sz w:val="24"/>
+          <w:szCs w:val="24"/>
+        </w:rPr>
+        <w:t xml:space="preserve"> about.html (near the bottom, above the footer)</w:t>
+      </w:r>
+      <w:r>
+        <w:rPr>
+          <w:rFonts w:ascii="Times New Roman" w:hAnsi="Times New Roman" w:cs="Times New Roman"/>
+          <w:sz w:val="24"/>
+          <w:szCs w:val="24"/>
+        </w:rPr>
+        <w:br/>
+      </w:r>
+      <w:r>
+        <w:rPr>
+          <w:rFonts w:ascii="Times New Roman" w:hAnsi="Times New Roman" w:cs="Times New Roman"/>
+          <w:b/>
+          <w:bCs/>
+          <w:sz w:val="24"/>
+          <w:szCs w:val="24"/>
+        </w:rPr>
+        <w:t>Component:</w:t>
+      </w:r>
+      <w:r>
+        <w:rPr>
+          <w:rFonts w:ascii="Times New Roman" w:hAnsi="Times New Roman" w:cs="Times New Roman"/>
+          <w:sz w:val="24"/>
+          <w:szCs w:val="24"/>
+        </w:rPr>
+        <w:t xml:space="preserve"> Bootstrap Accordion</w:t>
+      </w:r>
+      <w:r>
+        <w:rPr>
+          <w:rFonts w:ascii="Times New Roman" w:hAnsi="Times New Roman" w:cs="Times New Roman"/>
+          <w:sz w:val="24"/>
+          <w:szCs w:val="24"/>
+        </w:rPr>
+        <w:br/>
+      </w:r>
+      <w:r>
+        <w:rPr>
+          <w:rFonts w:ascii="Times New Roman" w:hAnsi="Times New Roman" w:cs="Times New Roman"/>
+          <w:b/>
+          <w:bCs/>
+          <w:sz w:val="24"/>
+          <w:szCs w:val="24"/>
+        </w:rPr>
+        <w:t>Purpose:</w:t>
+      </w:r>
+      <w:r>
+        <w:rPr>
+          <w:rFonts w:ascii="Times New Roman" w:hAnsi="Times New Roman" w:cs="Times New Roman"/>
+          <w:sz w:val="24"/>
+          <w:szCs w:val="24"/>
+        </w:rPr>
+        <w:t xml:space="preserve"> The accordion provides an organized FAQ section where users can expand/collapse questions. This improves readability by reducing long blocks of text and supports accessibility because each question is a focusable button with proper ARIA attributes.</w:t>
+      </w:r>
+    </w:p>
+    <w:p>
+      <w:pPr>
+        <w:rPr>
+          <w:rFonts w:ascii="Times New Roman" w:hAnsi="Times New Roman" w:cs="Times New Roman"/>
+          <w:sz w:val="24"/>
+          <w:szCs w:val="24"/>
+        </w:rPr>
+      </w:pPr>
+      <w:r>
+        <w:rPr>
+          <w:rFonts w:ascii="Times New Roman" w:hAnsi="Times New Roman" w:cs="Times New Roman"/>
+          <w:b/>
+          <w:bCs/>
+          <w:sz w:val="24"/>
+          <w:szCs w:val="24"/>
+        </w:rPr>
+        <w:t>What it contains:</w:t>
+      </w:r>
+    </w:p>
+    <w:p>
+      <w:pPr>
+        <w:numPr>
+          <w:ilvl w:val="0"/>
+          <w:numId w:val="10"/>
+        </w:numPr>
+        <w:rPr>
+          <w:rFonts w:ascii="Times New Roman" w:hAnsi="Times New Roman" w:cs="Times New Roman"/>
+          <w:sz w:val="24"/>
+          <w:szCs w:val="24"/>
+        </w:rPr>
+      </w:pPr>
+      <w:r>
+        <w:rPr>
+          <w:rFonts w:ascii="Times New Roman" w:hAnsi="Times New Roman" w:cs="Times New Roman"/>
+          <w:sz w:val="24"/>
+          <w:szCs w:val="24"/>
+        </w:rPr>
+        <w:t>“What is F1 Fan Hub?”</w:t>
+      </w:r>
+    </w:p>
+    <w:p>
+      <w:pPr>
+        <w:numPr>
+          <w:ilvl w:val="0"/>
+          <w:numId w:val="10"/>
+        </w:numPr>
+        <w:rPr>
+          <w:rFonts w:ascii="Times New Roman" w:hAnsi="Times New Roman" w:cs="Times New Roman"/>
+          <w:sz w:val="24"/>
+          <w:szCs w:val="24"/>
+        </w:rPr>
+      </w:pPr>
+      <w:r>
+        <w:rPr>
+          <w:rFonts w:ascii="Times New Roman" w:hAnsi="Times New Roman" w:cs="Times New Roman"/>
+          <w:sz w:val="24"/>
+          <w:szCs w:val="24"/>
+        </w:rPr>
+        <w:t>“Where are tasks stored?” (</w:t>
+      </w:r>
+      <w:proofErr w:type="spellStart"/>
+      <w:r>
+        <w:rPr>
+          <w:rFonts w:ascii="Times New Roman" w:hAnsi="Times New Roman" w:cs="Times New Roman"/>
+          <w:sz w:val="24"/>
+          <w:szCs w:val="24"/>
+        </w:rPr>
+        <w:t>localStorage</w:t>
+      </w:r>
+      <w:proofErr w:type="spellEnd"/>
+      <w:r>
+        <w:rPr>
+          <w:rFonts w:ascii="Times New Roman" w:hAnsi="Times New Roman" w:cs="Times New Roman"/>
+          <w:sz w:val="24"/>
+          <w:szCs w:val="24"/>
+        </w:rPr>
+        <w:t xml:space="preserve"> explanation)</w:t>
+      </w:r>
+    </w:p>
+    <w:p>
+      <w:pPr>
+        <w:numPr>
+          <w:ilvl w:val="0"/>
+          <w:numId w:val="10"/>
+        </w:numPr>
+        <w:rPr>
+          <w:rFonts w:ascii="Times New Roman" w:hAnsi="Times New Roman" w:cs="Times New Roman"/>
+          <w:sz w:val="24"/>
+          <w:szCs w:val="24"/>
+        </w:rPr>
+      </w:pPr>
+      <w:r>
+        <w:rPr>
+          <w:rFonts w:ascii="Times New Roman" w:hAnsi="Times New Roman" w:cs="Times New Roman"/>
+          <w:sz w:val="24"/>
+          <w:szCs w:val="24"/>
+        </w:rPr>
+        <w:t>“What does the Analytics page show?”</w:t>
+      </w:r>
+    </w:p>
+    <w:p>
+      <w:pPr>
+        <w:rPr>
+          <w:rFonts w:ascii="Times New Roman" w:hAnsi="Times New Roman" w:cs="Times New Roman"/>
+          <w:b/>
+          <w:bCs/>
+          <w:sz w:val="24"/>
+          <w:szCs w:val="24"/>
+        </w:rPr>
+      </w:pPr>
+      <w:r>
+        <w:rPr>
+          <w:rFonts w:ascii="Times New Roman" w:hAnsi="Times New Roman" w:cs="Times New Roman"/>
+          <w:b/>
+          <w:bCs/>
+          <w:sz w:val="24"/>
+          <w:szCs w:val="24"/>
+        </w:rPr>
+        <w:t>2) Toast Notifications (Tasks Page)</w:t>
+      </w:r>
+    </w:p>
+    <w:p>
+      <w:pPr>
+        <w:rPr>
+          <w:rFonts w:ascii="Times New Roman" w:hAnsi="Times New Roman" w:cs="Times New Roman"/>
+          <w:sz w:val="24"/>
+          <w:szCs w:val="24"/>
+        </w:rPr>
+      </w:pPr>
+      <w:r>
+        <w:rPr>
+          <w:rFonts w:ascii="Times New Roman" w:hAnsi="Times New Roman" w:cs="Times New Roman"/>
+          <w:b/>
+          <w:bCs/>
+          <w:sz w:val="24"/>
+          <w:szCs w:val="24"/>
+        </w:rPr>
+        <w:lastRenderedPageBreak/>
+        <w:t>Location:</w:t>
+      </w:r>
+      <w:r>
+        <w:rPr>
+          <w:rFonts w:ascii="Times New Roman" w:hAnsi="Times New Roman" w:cs="Times New Roman"/>
+          <w:sz w:val="24"/>
+          <w:szCs w:val="24"/>
+        </w:rPr>
+        <w:t xml:space="preserve"> tasks.html (toast container at the bottom-right of the page) and script.js (toast logic)</w:t>
+      </w:r>
+      <w:r>
+        <w:rPr>
+          <w:rFonts w:ascii="Times New Roman" w:hAnsi="Times New Roman" w:cs="Times New Roman"/>
+          <w:sz w:val="24"/>
+          <w:szCs w:val="24"/>
+        </w:rPr>
+        <w:br/>
+      </w:r>
+      <w:r>
+        <w:rPr>
+          <w:rFonts w:ascii="Times New Roman" w:hAnsi="Times New Roman" w:cs="Times New Roman"/>
+          <w:b/>
+          <w:bCs/>
+          <w:sz w:val="24"/>
+          <w:szCs w:val="24"/>
+        </w:rPr>
+        <w:t>Component:</w:t>
+      </w:r>
+      <w:r>
+        <w:rPr>
+          <w:rFonts w:ascii="Times New Roman" w:hAnsi="Times New Roman" w:cs="Times New Roman"/>
+          <w:sz w:val="24"/>
+          <w:szCs w:val="24"/>
+        </w:rPr>
+        <w:t xml:space="preserve"> Bootstrap Toast Notifications</w:t>
+      </w:r>
+      <w:r>
+        <w:rPr>
+          <w:rFonts w:ascii="Times New Roman" w:hAnsi="Times New Roman" w:cs="Times New Roman"/>
+          <w:sz w:val="24"/>
+          <w:szCs w:val="24"/>
+        </w:rPr>
+        <w:br/>
+      </w:r>
+      <w:r>
+        <w:rPr>
+          <w:rFonts w:ascii="Times New Roman" w:hAnsi="Times New Roman" w:cs="Times New Roman"/>
+          <w:b/>
+          <w:bCs/>
+          <w:sz w:val="24"/>
+          <w:szCs w:val="24"/>
+        </w:rPr>
+        <w:t>Purpose:</w:t>
+      </w:r>
+      <w:r>
+        <w:rPr>
+          <w:rFonts w:ascii="Times New Roman" w:hAnsi="Times New Roman" w:cs="Times New Roman"/>
+          <w:sz w:val="24"/>
+          <w:szCs w:val="24"/>
+        </w:rPr>
+        <w:t xml:space="preserve"> Toast notifications provide instant feedback after user actions on the Tasks page. Instead of only changing the table, the user gets a clear message confirming what happened. This improves user experience and makes the site feel like a real application.</w:t>
+      </w:r>
+    </w:p>
+    <w:p>
+      <w:pPr>
+        <w:rPr>
+          <w:rFonts w:ascii="Times New Roman" w:hAnsi="Times New Roman" w:cs="Times New Roman"/>
+          <w:sz w:val="24"/>
+          <w:szCs w:val="24"/>
+        </w:rPr>
+      </w:pPr>
+      <w:r>
+        <w:rPr>
+          <w:rFonts w:ascii="Times New Roman" w:hAnsi="Times New Roman" w:cs="Times New Roman"/>
+          <w:b/>
+          <w:bCs/>
+          <w:sz w:val="24"/>
+          <w:szCs w:val="24"/>
+        </w:rPr>
+        <w:t>When it appears:</w:t>
+      </w:r>
+    </w:p>
+    <w:p>
+      <w:pPr>
+        <w:numPr>
+          <w:ilvl w:val="0"/>
+          <w:numId w:val="11"/>
+        </w:numPr>
+        <w:rPr>
+          <w:rFonts w:ascii="Times New Roman" w:hAnsi="Times New Roman" w:cs="Times New Roman"/>
+          <w:sz w:val="24"/>
+          <w:szCs w:val="24"/>
+        </w:rPr>
+      </w:pPr>
+      <w:r>
+        <w:rPr>
+          <w:rFonts w:ascii="Times New Roman" w:hAnsi="Times New Roman" w:cs="Times New Roman"/>
+          <w:sz w:val="24"/>
+          <w:szCs w:val="24"/>
+        </w:rPr>
+        <w:t>When a task is added</w:t>
+      </w:r>
+    </w:p>
+    <w:p>
+      <w:pPr>
+        <w:numPr>
+          <w:ilvl w:val="0"/>
+          <w:numId w:val="11"/>
+        </w:numPr>
+        <w:rPr>
+          <w:rFonts w:ascii="Times New Roman" w:hAnsi="Times New Roman" w:cs="Times New Roman"/>
+          <w:sz w:val="24"/>
+          <w:szCs w:val="24"/>
+        </w:rPr>
+      </w:pPr>
+      <w:r>
+        <w:rPr>
+          <w:rFonts w:ascii="Times New Roman" w:hAnsi="Times New Roman" w:cs="Times New Roman"/>
+          <w:sz w:val="24"/>
+          <w:szCs w:val="24"/>
+        </w:rPr>
+        <w:t>When a task is marked completed / reopened</w:t>
+      </w:r>
+    </w:p>
+    <w:p>
+      <w:pPr>
+        <w:numPr>
+          <w:ilvl w:val="0"/>
+          <w:numId w:val="11"/>
+        </w:numPr>
+        <w:rPr>
+          <w:rFonts w:ascii="Times New Roman" w:hAnsi="Times New Roman" w:cs="Times New Roman"/>
+          <w:sz w:val="24"/>
+          <w:szCs w:val="24"/>
+        </w:rPr>
+      </w:pPr>
+      <w:r>
+        <w:rPr>
+          <w:rFonts w:ascii="Times New Roman" w:hAnsi="Times New Roman" w:cs="Times New Roman"/>
+          <w:sz w:val="24"/>
+          <w:szCs w:val="24"/>
+        </w:rPr>
+        <w:t>When a task is edited</w:t>
+      </w:r>
+    </w:p>
+    <w:p>
+      <w:pPr>
+        <w:numPr>
+          <w:ilvl w:val="0"/>
+          <w:numId w:val="11"/>
+        </w:numPr>
+        <w:rPr>
+          <w:rFonts w:ascii="Times New Roman" w:hAnsi="Times New Roman" w:cs="Times New Roman"/>
+          <w:sz w:val="24"/>
+          <w:szCs w:val="24"/>
+        </w:rPr>
+      </w:pPr>
+      <w:r>
+        <w:rPr>
+          <w:rFonts w:ascii="Times New Roman" w:hAnsi="Times New Roman" w:cs="Times New Roman"/>
+          <w:sz w:val="24"/>
+          <w:szCs w:val="24"/>
+        </w:rPr>
+        <w:t>When a task is deleted</w:t>
+      </w:r>
+    </w:p>
+    <w:p>
+      <w:pPr>
+        <w:rPr>
+          <w:rFonts w:ascii="Times New Roman" w:hAnsi="Times New Roman" w:cs="Times New Roman"/>
+          <w:b/>
+          <w:bCs/>
+          <w:sz w:val="24"/>
+          <w:szCs w:val="24"/>
+        </w:rPr>
+      </w:pPr>
+      <w:r>
+        <w:rPr>
+          <w:rFonts w:ascii="Times New Roman" w:hAnsi="Times New Roman" w:cs="Times New Roman"/>
+          <w:b/>
+          <w:bCs/>
+          <w:sz w:val="24"/>
+          <w:szCs w:val="24"/>
+        </w:rPr>
+        <w:t>3) Back-to-Top Floating Button</w:t>
+      </w:r>
+    </w:p>
+    <w:p>
+      <w:pPr>
+        <w:rPr>
+          <w:rFonts w:ascii="Times New Roman" w:hAnsi="Times New Roman" w:cs="Times New Roman"/>
+          <w:sz w:val="24"/>
+          <w:szCs w:val="24"/>
+        </w:rPr>
+      </w:pPr>
+      <w:r>
+        <w:rPr>
+          <w:rFonts w:ascii="Times New Roman" w:hAnsi="Times New Roman" w:cs="Times New Roman"/>
+          <w:b/>
+          <w:bCs/>
+          <w:sz w:val="24"/>
+          <w:szCs w:val="24"/>
+        </w:rPr>
+        <w:t>Location:</w:t>
+      </w:r>
+      <w:r>
+        <w:rPr>
+          <w:rFonts w:ascii="Times New Roman" w:hAnsi="Times New Roman" w:cs="Times New Roman"/>
+          <w:sz w:val="24"/>
+          <w:szCs w:val="24"/>
+        </w:rPr>
+        <w:t xml:space="preserve"> Included in </w:t>
+      </w:r>
+      <w:r>
+        <w:rPr>
+          <w:rFonts w:ascii="Times New Roman" w:hAnsi="Times New Roman" w:cs="Times New Roman"/>
+          <w:b/>
+          <w:bCs/>
+          <w:sz w:val="24"/>
+          <w:szCs w:val="24"/>
+        </w:rPr>
+        <w:t>about.html</w:t>
+      </w:r>
+      <w:r>
+        <w:rPr>
+          <w:rFonts w:ascii="Times New Roman" w:hAnsi="Times New Roman" w:cs="Times New Roman"/>
+          <w:sz w:val="24"/>
+          <w:szCs w:val="24"/>
+        </w:rPr>
+        <w:t xml:space="preserve"> near the end of the &lt;body&gt;, with styling in style.css and behavior in script.js.</w:t>
+      </w:r>
+      <w:r>
+        <w:rPr>
+          <w:rFonts w:ascii="Times New Roman" w:hAnsi="Times New Roman" w:cs="Times New Roman"/>
+          <w:sz w:val="24"/>
+          <w:szCs w:val="24"/>
+        </w:rPr>
+        <w:br/>
+      </w:r>
+      <w:r>
+        <w:rPr>
+          <w:rFonts w:ascii="Times New Roman" w:hAnsi="Times New Roman" w:cs="Times New Roman"/>
+          <w:b/>
+          <w:bCs/>
+          <w:sz w:val="24"/>
+          <w:szCs w:val="24"/>
+        </w:rPr>
+        <w:t>Component:</w:t>
+      </w:r>
+      <w:r>
+        <w:rPr>
+          <w:rFonts w:ascii="Times New Roman" w:hAnsi="Times New Roman" w:cs="Times New Roman"/>
+          <w:sz w:val="24"/>
+          <w:szCs w:val="24"/>
+        </w:rPr>
+        <w:t xml:space="preserve"> Floating “Back to Top” button</w:t>
+      </w:r>
+      <w:r>
+        <w:rPr>
+          <w:rFonts w:ascii="Times New Roman" w:hAnsi="Times New Roman" w:cs="Times New Roman"/>
+          <w:sz w:val="24"/>
+          <w:szCs w:val="24"/>
+        </w:rPr>
+        <w:br/>
+      </w:r>
+      <w:r>
+        <w:rPr>
+          <w:rFonts w:ascii="Times New Roman" w:hAnsi="Times New Roman" w:cs="Times New Roman"/>
+          <w:b/>
+          <w:bCs/>
+          <w:sz w:val="24"/>
+          <w:szCs w:val="24"/>
+        </w:rPr>
+        <w:t>Purpose:</w:t>
+      </w:r>
+      <w:r>
+        <w:rPr>
+          <w:rFonts w:ascii="Times New Roman" w:hAnsi="Times New Roman" w:cs="Times New Roman"/>
+          <w:sz w:val="24"/>
+          <w:szCs w:val="24"/>
+        </w:rPr>
+        <w:t xml:space="preserve"> This component improves navigation and accessibility by allowing users to quickly return to the top of a page, especially on pages with long content (About and Tasks). The button only appears after scrolling down and uses smooth scrolling when clicked.</w:t>
+      </w:r>
+    </w:p>
+    <w:p>
+      <w:pPr>
+        <w:rPr>
+          <w:rFonts w:ascii="Times New Roman" w:hAnsi="Times New Roman" w:cs="Times New Roman"/>
+          <w:sz w:val="24"/>
+          <w:szCs w:val="24"/>
+        </w:rPr>
+      </w:pPr>
+      <w:r>
+        <w:rPr>
+          <w:rFonts w:ascii="Times New Roman" w:hAnsi="Times New Roman" w:cs="Times New Roman"/>
+          <w:b/>
+          <w:bCs/>
+          <w:sz w:val="24"/>
+          <w:szCs w:val="24"/>
+        </w:rPr>
+        <w:t>Behavior:</w:t>
+      </w:r>
+    </w:p>
+    <w:p>
+      <w:pPr>
+        <w:numPr>
+          <w:ilvl w:val="0"/>
+          <w:numId w:val="12"/>
+        </w:numPr>
+        <w:rPr>
+          <w:rFonts w:ascii="Times New Roman" w:hAnsi="Times New Roman" w:cs="Times New Roman"/>
+          <w:sz w:val="24"/>
+          <w:szCs w:val="24"/>
+        </w:rPr>
+      </w:pPr>
+      <w:r>
+        <w:rPr>
+          <w:rFonts w:ascii="Times New Roman" w:hAnsi="Times New Roman" w:cs="Times New Roman"/>
+          <w:sz w:val="24"/>
+          <w:szCs w:val="24"/>
+        </w:rPr>
+        <w:t>Hidden at the top of the page</w:t>
+      </w:r>
+    </w:p>
+    <w:p>
+      <w:pPr>
+        <w:numPr>
+          <w:ilvl w:val="0"/>
+          <w:numId w:val="12"/>
+        </w:numPr>
+        <w:rPr>
+          <w:rFonts w:ascii="Times New Roman" w:hAnsi="Times New Roman" w:cs="Times New Roman"/>
+          <w:sz w:val="24"/>
+          <w:szCs w:val="24"/>
+        </w:rPr>
+      </w:pPr>
+      <w:r>
+        <w:rPr>
+          <w:rFonts w:ascii="Times New Roman" w:hAnsi="Times New Roman" w:cs="Times New Roman"/>
+          <w:sz w:val="24"/>
+          <w:szCs w:val="24"/>
+        </w:rPr>
+        <w:t>Appears after scrolling down ~250px</w:t>
+      </w:r>
+    </w:p>
+    <w:p>
+      <w:pPr>
+        <w:numPr>
+          <w:ilvl w:val="0"/>
+          <w:numId w:val="12"/>
+        </w:numPr>
+        <w:rPr>
+          <w:rFonts w:ascii="Times New Roman" w:hAnsi="Times New Roman" w:cs="Times New Roman"/>
+          <w:sz w:val="24"/>
+          <w:szCs w:val="24"/>
+        </w:rPr>
+      </w:pPr>
+      <w:r>
+        <w:rPr>
+          <w:rFonts w:ascii="Times New Roman" w:hAnsi="Times New Roman" w:cs="Times New Roman"/>
+          <w:sz w:val="24"/>
+          <w:szCs w:val="24"/>
+        </w:rPr>
+        <w:t>Smooth scrolls to the top when clicked</w:t>
+      </w:r>
+    </w:p>
+    <w:p>
+      <w:pPr>
+        <w:pStyle w:val="21"/>
+        <w:rPr>
+          <w:rFonts w:ascii="Times New Roman" w:hAnsi="Times New Roman" w:cs="Times New Roman"/>
+          <w:sz w:val="28"/>
+          <w:szCs w:val="28"/>
+        </w:rPr>
+      </w:pPr>
+      <w:bookmarkStart w:id="12" w:name="_Toc223433414"/>
+      <w:r>
+        <w:rPr>
+          <w:rFonts w:ascii="Times New Roman" w:hAnsi="Times New Roman" w:cs="Times New Roman"/>
+          <w:sz w:val="28"/>
+          <w:szCs w:val="28"/>
+        </w:rPr>
+        <w:t>6</w:t>
+      </w:r>
+      <w:r>
+        <w:rPr>
+          <w:rFonts w:ascii="Times New Roman" w:hAnsi="Times New Roman" w:cs="Times New Roman"/>
+          <w:sz w:val="28"/>
+          <w:szCs w:val="28"/>
+        </w:rPr>
+        <w:t xml:space="preserve">. </w:t>
+      </w:r>
+      <w:r>
+        <w:rPr>
+          <w:rFonts w:ascii="Times New Roman" w:hAnsi="Times New Roman" w:cs="Times New Roman"/>
+          <w:sz w:val="28"/>
+          <w:szCs w:val="28"/>
+        </w:rPr>
+        <w:t>AI Usage</w:t>
+      </w:r>
+      <w:bookmarkEnd w:id="12"/>
+    </w:p>
+    <w:p>
+      <w:pPr>
+        <w:rPr>
+          <w:rFonts w:ascii="Times New Roman" w:hAnsi="Times New Roman" w:cs="Times New Roman"/>
+          <w:sz w:val="24"/>
+          <w:szCs w:val="24"/>
+        </w:rPr>
+      </w:pPr>
+      <w:r>
+        <w:rPr>
+          <w:rFonts w:ascii="Times New Roman" w:hAnsi="Times New Roman" w:cs="Times New Roman"/>
+          <w:sz w:val="24"/>
+          <w:szCs w:val="24"/>
+        </w:rPr>
+        <w:t>AI tools were used as an assistant during this project to support learning and productivity. Specifically, AI was used to help brainstorm design ideas, suggest improvements for HTML/CSS layout, and provide guidance on JavaScript logic (such as task filtering/sorting and form validation). All code was reviewed, adapted, and integrated by me, and I tested the website functionality, fixed errors, and ensured the final implementation matched the assignment requirements. The final project reflects my own understanding and decisions, and I am able to explain the structure and code in detail.</w:t>
+      </w:r>
+      <w:r>
+        <w:rPr>
+          <w:rFonts w:ascii="Times New Roman" w:hAnsi="Times New Roman" w:cs="Times New Roman"/>
+          <w:sz w:val="24"/>
+          <w:szCs w:val="24"/>
+        </w:rPr>
+        <w:br/>
+      </w:r>
+    </w:p>
+    <w:p>
+      <w:pPr>
+        <w:pStyle w:val="21"/>
+        <w:rPr>
+          <w:rFonts w:ascii="Times New Roman" w:hAnsi="Times New Roman" w:cs="Times New Roman"/>
+          <w:sz w:val="28"/>
+          <w:szCs w:val="28"/>
+        </w:rPr>
+      </w:pPr>
+      <w:bookmarkStart w:id="13" w:name="_Toc223433415"/>
+      <w:r>
+        <w:rPr>
+          <w:rFonts w:ascii="Times New Roman" w:hAnsi="Times New Roman" w:cs="Times New Roman"/>
+          <w:sz w:val="28"/>
+          <w:szCs w:val="28"/>
+        </w:rPr>
+        <w:lastRenderedPageBreak/>
+        <w:t>7</w:t>
+      </w:r>
+      <w:r>
+        <w:rPr>
+          <w:rFonts w:ascii="Times New Roman" w:hAnsi="Times New Roman" w:cs="Times New Roman"/>
+          <w:sz w:val="28"/>
+          <w:szCs w:val="28"/>
+        </w:rPr>
+        <w:t>. Reflections</w:t>
+      </w:r>
+      <w:bookmarkEnd w:id="13"/>
     </w:p>
     <w:p>
       <w:pPr>
@@ -3623,6 +4564,453 @@
       </w:rPr>
     </w:lvl>
   </w:abstractNum>
+  <w:abstractNum w:abstractNumId="9" w15:restartNumberingAfterBreak="0">
+    <w:nsid w:val="06A87FA4"/>
+    <w:multiLevelType w:val="multilevel"/>
+    <w:tmpl w:val="2A5209EC"/>
+    <w:lvl w:ilvl="0">
+      <w:start w:val="1"/>
+      <w:numFmt w:val="bullet"/>
+      <w:lvlText w:val=""/>
+      <w:lvlJc w:val="left"/>
+      <w:pPr>
+        <w:tabs>
+          <w:tab w:val="num" w:pos="720"/>
+        </w:tabs>
+        <w:ind w:left="720" w:hanging="360"/>
+      </w:pPr>
+      <w:rPr>
+        <w:rFonts w:ascii="Symbol" w:hAnsi="Symbol" w:hint="default"/>
+        <w:sz w:val="20"/>
+      </w:rPr>
+    </w:lvl>
+    <w:lvl w:ilvl="1" w:tentative="1">
+      <w:start w:val="1"/>
+      <w:numFmt w:val="bullet"/>
+      <w:lvlText w:val="o"/>
+      <w:lvlJc w:val="left"/>
+      <w:pPr>
+        <w:tabs>
+          <w:tab w:val="num" w:pos="1440"/>
+        </w:tabs>
+        <w:ind w:left="1440" w:hanging="360"/>
+      </w:pPr>
+      <w:rPr>
+        <w:rFonts w:ascii="Courier New" w:hAnsi="Courier New" w:hint="default"/>
+        <w:sz w:val="20"/>
+      </w:rPr>
+    </w:lvl>
+    <w:lvl w:ilvl="2" w:tentative="1">
+      <w:start w:val="1"/>
+      <w:numFmt w:val="bullet"/>
+      <w:lvlText w:val=""/>
+      <w:lvlJc w:val="left"/>
+      <w:pPr>
+        <w:tabs>
+          <w:tab w:val="num" w:pos="2160"/>
+        </w:tabs>
+        <w:ind w:left="2160" w:hanging="360"/>
+      </w:pPr>
+      <w:rPr>
+        <w:rFonts w:ascii="Wingdings" w:hAnsi="Wingdings" w:hint="default"/>
+        <w:sz w:val="20"/>
+      </w:rPr>
+    </w:lvl>
+    <w:lvl w:ilvl="3" w:tentative="1">
+      <w:start w:val="1"/>
+      <w:numFmt w:val="bullet"/>
+      <w:lvlText w:val=""/>
+      <w:lvlJc w:val="left"/>
+      <w:pPr>
+        <w:tabs>
+          <w:tab w:val="num" w:pos="2880"/>
+        </w:tabs>
+        <w:ind w:left="2880" w:hanging="360"/>
+      </w:pPr>
+      <w:rPr>
+        <w:rFonts w:ascii="Wingdings" w:hAnsi="Wingdings" w:hint="default"/>
+        <w:sz w:val="20"/>
+      </w:rPr>
+    </w:lvl>
+    <w:lvl w:ilvl="4" w:tentative="1">
+      <w:start w:val="1"/>
+      <w:numFmt w:val="bullet"/>
+      <w:lvlText w:val=""/>
+      <w:lvlJc w:val="left"/>
+      <w:pPr>
+        <w:tabs>
+          <w:tab w:val="num" w:pos="3600"/>
+        </w:tabs>
+        <w:ind w:left="3600" w:hanging="360"/>
+      </w:pPr>
+      <w:rPr>
+        <w:rFonts w:ascii="Wingdings" w:hAnsi="Wingdings" w:hint="default"/>
+        <w:sz w:val="20"/>
+      </w:rPr>
+    </w:lvl>
+    <w:lvl w:ilvl="5" w:tentative="1">
+      <w:start w:val="1"/>
+      <w:numFmt w:val="bullet"/>
+      <w:lvlText w:val=""/>
+      <w:lvlJc w:val="left"/>
+      <w:pPr>
+        <w:tabs>
+          <w:tab w:val="num" w:pos="4320"/>
+        </w:tabs>
+        <w:ind w:left="4320" w:hanging="360"/>
+      </w:pPr>
+      <w:rPr>
+        <w:rFonts w:ascii="Wingdings" w:hAnsi="Wingdings" w:hint="default"/>
+        <w:sz w:val="20"/>
+      </w:rPr>
+    </w:lvl>
+    <w:lvl w:ilvl="6" w:tentative="1">
+      <w:start w:val="1"/>
+      <w:numFmt w:val="bullet"/>
+      <w:lvlText w:val=""/>
+      <w:lvlJc w:val="left"/>
+      <w:pPr>
+        <w:tabs>
+          <w:tab w:val="num" w:pos="5040"/>
+        </w:tabs>
+        <w:ind w:left="5040" w:hanging="360"/>
+      </w:pPr>
+      <w:rPr>
+        <w:rFonts w:ascii="Wingdings" w:hAnsi="Wingdings" w:hint="default"/>
+        <w:sz w:val="20"/>
+      </w:rPr>
+    </w:lvl>
+    <w:lvl w:ilvl="7" w:tentative="1">
+      <w:start w:val="1"/>
+      <w:numFmt w:val="bullet"/>
+      <w:lvlText w:val=""/>
+      <w:lvlJc w:val="left"/>
+      <w:pPr>
+        <w:tabs>
+          <w:tab w:val="num" w:pos="5760"/>
+        </w:tabs>
+        <w:ind w:left="5760" w:hanging="360"/>
+      </w:pPr>
+      <w:rPr>
+        <w:rFonts w:ascii="Wingdings" w:hAnsi="Wingdings" w:hint="default"/>
+        <w:sz w:val="20"/>
+      </w:rPr>
+    </w:lvl>
+    <w:lvl w:ilvl="8" w:tentative="1">
+      <w:start w:val="1"/>
+      <w:numFmt w:val="bullet"/>
+      <w:lvlText w:val=""/>
+      <w:lvlJc w:val="left"/>
+      <w:pPr>
+        <w:tabs>
+          <w:tab w:val="num" w:pos="6480"/>
+        </w:tabs>
+        <w:ind w:left="6480" w:hanging="360"/>
+      </w:pPr>
+      <w:rPr>
+        <w:rFonts w:ascii="Wingdings" w:hAnsi="Wingdings" w:hint="default"/>
+        <w:sz w:val="20"/>
+      </w:rPr>
+    </w:lvl>
+  </w:abstractNum>
+  <w:abstractNum w:abstractNumId="10" w15:restartNumberingAfterBreak="0">
+    <w:nsid w:val="17A07F02"/>
+    <w:multiLevelType w:val="multilevel"/>
+    <w:tmpl w:val="9CE6A39A"/>
+    <w:lvl w:ilvl="0">
+      <w:start w:val="1"/>
+      <w:numFmt w:val="bullet"/>
+      <w:lvlText w:val=""/>
+      <w:lvlJc w:val="left"/>
+      <w:pPr>
+        <w:tabs>
+          <w:tab w:val="num" w:pos="720"/>
+        </w:tabs>
+        <w:ind w:left="720" w:hanging="360"/>
+      </w:pPr>
+      <w:rPr>
+        <w:rFonts w:ascii="Symbol" w:hAnsi="Symbol" w:hint="default"/>
+        <w:sz w:val="20"/>
+      </w:rPr>
+    </w:lvl>
+    <w:lvl w:ilvl="1" w:tentative="1">
+      <w:start w:val="1"/>
+      <w:numFmt w:val="bullet"/>
+      <w:lvlText w:val="o"/>
+      <w:lvlJc w:val="left"/>
+      <w:pPr>
+        <w:tabs>
+          <w:tab w:val="num" w:pos="1440"/>
+        </w:tabs>
+        <w:ind w:left="1440" w:hanging="360"/>
+      </w:pPr>
+      <w:rPr>
+        <w:rFonts w:ascii="Courier New" w:hAnsi="Courier New" w:hint="default"/>
+        <w:sz w:val="20"/>
+      </w:rPr>
+    </w:lvl>
+    <w:lvl w:ilvl="2" w:tentative="1">
+      <w:start w:val="1"/>
+      <w:numFmt w:val="bullet"/>
+      <w:lvlText w:val=""/>
+      <w:lvlJc w:val="left"/>
+      <w:pPr>
+        <w:tabs>
+          <w:tab w:val="num" w:pos="2160"/>
+        </w:tabs>
+        <w:ind w:left="2160" w:hanging="360"/>
+      </w:pPr>
+      <w:rPr>
+        <w:rFonts w:ascii="Wingdings" w:hAnsi="Wingdings" w:hint="default"/>
+        <w:sz w:val="20"/>
+      </w:rPr>
+    </w:lvl>
+    <w:lvl w:ilvl="3" w:tentative="1">
+      <w:start w:val="1"/>
+      <w:numFmt w:val="bullet"/>
+      <w:lvlText w:val=""/>
+      <w:lvlJc w:val="left"/>
+      <w:pPr>
+        <w:tabs>
+          <w:tab w:val="num" w:pos="2880"/>
+        </w:tabs>
+        <w:ind w:left="2880" w:hanging="360"/>
+      </w:pPr>
+      <w:rPr>
+        <w:rFonts w:ascii="Wingdings" w:hAnsi="Wingdings" w:hint="default"/>
+        <w:sz w:val="20"/>
+      </w:rPr>
+    </w:lvl>
+    <w:lvl w:ilvl="4" w:tentative="1">
+      <w:start w:val="1"/>
+      <w:numFmt w:val="bullet"/>
+      <w:lvlText w:val=""/>
+      <w:lvlJc w:val="left"/>
+      <w:pPr>
+        <w:tabs>
+          <w:tab w:val="num" w:pos="3600"/>
+        </w:tabs>
+        <w:ind w:left="3600" w:hanging="360"/>
+      </w:pPr>
+      <w:rPr>
+        <w:rFonts w:ascii="Wingdings" w:hAnsi="Wingdings" w:hint="default"/>
+        <w:sz w:val="20"/>
+      </w:rPr>
+    </w:lvl>
+    <w:lvl w:ilvl="5" w:tentative="1">
+      <w:start w:val="1"/>
+      <w:numFmt w:val="bullet"/>
+      <w:lvlText w:val=""/>
+      <w:lvlJc w:val="left"/>
+      <w:pPr>
+        <w:tabs>
+          <w:tab w:val="num" w:pos="4320"/>
+        </w:tabs>
+        <w:ind w:left="4320" w:hanging="360"/>
+      </w:pPr>
+      <w:rPr>
+        <w:rFonts w:ascii="Wingdings" w:hAnsi="Wingdings" w:hint="default"/>
+        <w:sz w:val="20"/>
+      </w:rPr>
+    </w:lvl>
+    <w:lvl w:ilvl="6" w:tentative="1">
+      <w:start w:val="1"/>
+      <w:numFmt w:val="bullet"/>
+      <w:lvlText w:val=""/>
+      <w:lvlJc w:val="left"/>
+      <w:pPr>
+        <w:tabs>
+          <w:tab w:val="num" w:pos="5040"/>
+        </w:tabs>
+        <w:ind w:left="5040" w:hanging="360"/>
+      </w:pPr>
+      <w:rPr>
+        <w:rFonts w:ascii="Wingdings" w:hAnsi="Wingdings" w:hint="default"/>
+        <w:sz w:val="20"/>
+      </w:rPr>
+    </w:lvl>
+    <w:lvl w:ilvl="7" w:tentative="1">
+      <w:start w:val="1"/>
+      <w:numFmt w:val="bullet"/>
+      <w:lvlText w:val=""/>
+      <w:lvlJc w:val="left"/>
+      <w:pPr>
+        <w:tabs>
+          <w:tab w:val="num" w:pos="5760"/>
+        </w:tabs>
+        <w:ind w:left="5760" w:hanging="360"/>
+      </w:pPr>
+      <w:rPr>
+        <w:rFonts w:ascii="Wingdings" w:hAnsi="Wingdings" w:hint="default"/>
+        <w:sz w:val="20"/>
+      </w:rPr>
+    </w:lvl>
+    <w:lvl w:ilvl="8" w:tentative="1">
+      <w:start w:val="1"/>
+      <w:numFmt w:val="bullet"/>
+      <w:lvlText w:val=""/>
+      <w:lvlJc w:val="left"/>
+      <w:pPr>
+        <w:tabs>
+          <w:tab w:val="num" w:pos="6480"/>
+        </w:tabs>
+        <w:ind w:left="6480" w:hanging="360"/>
+      </w:pPr>
+      <w:rPr>
+        <w:rFonts w:ascii="Wingdings" w:hAnsi="Wingdings" w:hint="default"/>
+        <w:sz w:val="20"/>
+      </w:rPr>
+    </w:lvl>
+  </w:abstractNum>
+  <w:abstractNum w:abstractNumId="11" w15:restartNumberingAfterBreak="0">
+    <w:nsid w:val="624D7C5E"/>
+    <w:multiLevelType w:val="multilevel"/>
+    <w:tmpl w:val="F72847EC"/>
+    <w:lvl w:ilvl="0">
+      <w:start w:val="1"/>
+      <w:numFmt w:val="bullet"/>
+      <w:lvlText w:val=""/>
+      <w:lvlJc w:val="left"/>
+      <w:pPr>
+        <w:tabs>
+          <w:tab w:val="num" w:pos="720"/>
+        </w:tabs>
+        <w:ind w:left="720" w:hanging="360"/>
+      </w:pPr>
+      <w:rPr>
+        <w:rFonts w:ascii="Symbol" w:hAnsi="Symbol" w:hint="default"/>
+        <w:sz w:val="20"/>
+      </w:rPr>
+    </w:lvl>
+    <w:lvl w:ilvl="1" w:tentative="1">
+      <w:start w:val="1"/>
+      <w:numFmt w:val="bullet"/>
+      <w:lvlText w:val="o"/>
+      <w:lvlJc w:val="left"/>
+      <w:pPr>
+        <w:tabs>
+          <w:tab w:val="num" w:pos="1440"/>
+        </w:tabs>
+        <w:ind w:left="1440" w:hanging="360"/>
+      </w:pPr>
+      <w:rPr>
+        <w:rFonts w:ascii="Courier New" w:hAnsi="Courier New" w:hint="default"/>
+        <w:sz w:val="20"/>
+      </w:rPr>
+    </w:lvl>
+    <w:lvl w:ilvl="2" w:tentative="1">
+      <w:start w:val="1"/>
+      <w:numFmt w:val="bullet"/>
+      <w:lvlText w:val=""/>
+      <w:lvlJc w:val="left"/>
+      <w:pPr>
+        <w:tabs>
+          <w:tab w:val="num" w:pos="2160"/>
+        </w:tabs>
+        <w:ind w:left="2160" w:hanging="360"/>
+      </w:pPr>
+      <w:rPr>
+        <w:rFonts w:ascii="Wingdings" w:hAnsi="Wingdings" w:hint="default"/>
+        <w:sz w:val="20"/>
+      </w:rPr>
+    </w:lvl>
+    <w:lvl w:ilvl="3" w:tentative="1">
+      <w:start w:val="1"/>
+      <w:numFmt w:val="bullet"/>
+      <w:lvlText w:val=""/>
+      <w:lvlJc w:val="left"/>
+      <w:pPr>
+        <w:tabs>
+          <w:tab w:val="num" w:pos="2880"/>
+        </w:tabs>
+        <w:ind w:left="2880" w:hanging="360"/>
+      </w:pPr>
+      <w:rPr>
+        <w:rFonts w:ascii="Wingdings" w:hAnsi="Wingdings" w:hint="default"/>
+        <w:sz w:val="20"/>
+      </w:rPr>
+    </w:lvl>
+    <w:lvl w:ilvl="4" w:tentative="1">
+      <w:start w:val="1"/>
+      <w:numFmt w:val="bullet"/>
+      <w:lvlText w:val=""/>
+      <w:lvlJc w:val="left"/>
+      <w:pPr>
+        <w:tabs>
+          <w:tab w:val="num" w:pos="3600"/>
+        </w:tabs>
+        <w:ind w:left="3600" w:hanging="360"/>
+      </w:pPr>
+      <w:rPr>
+        <w:rFonts w:ascii="Wingdings" w:hAnsi="Wingdings" w:hint="default"/>
+        <w:sz w:val="20"/>
+      </w:rPr>
+    </w:lvl>
+    <w:lvl w:ilvl="5" w:tentative="1">
+      <w:start w:val="1"/>
+      <w:numFmt w:val="bullet"/>
+      <w:lvlText w:val=""/>
+      <w:lvlJc w:val="left"/>
+      <w:pPr>
+        <w:tabs>
+          <w:tab w:val="num" w:pos="4320"/>
+        </w:tabs>
+        <w:ind w:left="4320" w:hanging="360"/>
+      </w:pPr>
+      <w:rPr>
+        <w:rFonts w:ascii="Wingdings" w:hAnsi="Wingdings" w:hint="default"/>
+        <w:sz w:val="20"/>
+      </w:rPr>
+    </w:lvl>
+    <w:lvl w:ilvl="6" w:tentative="1">
+      <w:start w:val="1"/>
+      <w:numFmt w:val="bullet"/>
+      <w:lvlText w:val=""/>
+      <w:lvlJc w:val="left"/>
+      <w:pPr>
+        <w:tabs>
+          <w:tab w:val="num" w:pos="5040"/>
+        </w:tabs>
+        <w:ind w:left="5040" w:hanging="360"/>
+      </w:pPr>
+      <w:rPr>
+        <w:rFonts w:ascii="Wingdings" w:hAnsi="Wingdings" w:hint="default"/>
+        <w:sz w:val="20"/>
+      </w:rPr>
+    </w:lvl>
+    <w:lvl w:ilvl="7" w:tentative="1">
+      <w:start w:val="1"/>
+      <w:numFmt w:val="bullet"/>
+      <w:lvlText w:val=""/>
+      <w:lvlJc w:val="left"/>
+      <w:pPr>
+        <w:tabs>
+          <w:tab w:val="num" w:pos="5760"/>
+        </w:tabs>
+        <w:ind w:left="5760" w:hanging="360"/>
+      </w:pPr>
+      <w:rPr>
+        <w:rFonts w:ascii="Wingdings" w:hAnsi="Wingdings" w:hint="default"/>
+        <w:sz w:val="20"/>
+      </w:rPr>
+    </w:lvl>
+    <w:lvl w:ilvl="8" w:tentative="1">
+      <w:start w:val="1"/>
+      <w:numFmt w:val="bullet"/>
+      <w:lvlText w:val=""/>
+      <w:lvlJc w:val="left"/>
+      <w:pPr>
+        <w:tabs>
+          <w:tab w:val="num" w:pos="6480"/>
+        </w:tabs>
+        <w:ind w:left="6480" w:hanging="360"/>
+      </w:pPr>
+      <w:rPr>
+        <w:rFonts w:ascii="Wingdings" w:hAnsi="Wingdings" w:hint="default"/>
+        <w:sz w:val="20"/>
+      </w:rPr>
+    </w:lvl>
+  </w:abstractNum>
   <w:num w:numId="1" w16cid:durableId="564798553">
     <w:abstractNumId w:val="8"/>
   </w:num>
@@ -3649,6 +5037,15 @@
   </w:num>
   <w:num w:numId="9" w16cid:durableId="1483497654">
     <w:abstractNumId w:val="0"/>
+  </w:num>
+  <w:num w:numId="10" w16cid:durableId="305820239">
+    <w:abstractNumId w:val="9"/>
+  </w:num>
+  <w:num w:numId="11" w16cid:durableId="2004116025">
+    <w:abstractNumId w:val="10"/>
+  </w:num>
+  <w:num w:numId="12" w16cid:durableId="1251039990">
+    <w:abstractNumId w:val="11"/>
   </w:num>
 </w:numbering>
 </file>

</xml_diff>